<commit_message>
Update AI adaptation services, refresh documentation, and swap presentation files
</commit_message>
<xml_diff>
--- a/docs/02_Technical_Documentation.docx
+++ b/docs/02_Technical_Documentation.docx
@@ -145,7 +145,7 @@
                 <w:color w:val="111111"/>
                 <w:sz w:val="20"/>
               </w:rPr>
-              <w:t>1.3</w:t>
+              <w:t>1.4</w:t>
             </w:r>
           </w:p>
         </w:tc>
@@ -181,7 +181,7 @@
                 <w:color w:val="111111"/>
                 <w:sz w:val="20"/>
               </w:rPr>
-              <w:t>2026-08-31</w:t>
+              <w:t>2026-09-03</w:t>
             </w:r>
           </w:p>
         </w:tc>
@@ -1230,7 +1230,7 @@
           <w:color w:val="111111"/>
           <w:sz w:val="22"/>
         </w:rPr>
-        <w:t xml:space="preserve"> / </w:t>
+        <w:t xml:space="preserve"> (slot 1) and </w:t>
       </w:r>
       <w:r>
         <w:rPr>
@@ -1247,7 +1247,7 @@
           <w:color w:val="111111"/>
           <w:sz w:val="22"/>
         </w:rPr>
-        <w:t xml:space="preserve"> (env only; read live so config changes take effect without restart).</w:t>
+        <w:t xml:space="preserve"> (slot 2) — env only; read live so config changes take effect without restart.</w:t>
       </w:r>
     </w:p>
     <w:p>
@@ -1279,6 +1279,64 @@
           <w:sz w:val="22"/>
         </w:rPr>
         <w:t xml:space="preserve"> which enforces a JSON response schema.</w:t>
+      </w:r>
+    </w:p>
+    <w:p>
+      <w:pPr>
+        <w:pStyle w:val="ListBullet"/>
+      </w:pPr>
+      <w:r>
+        <w:rPr>
+          <w:rFonts w:ascii="Calibri" w:hAnsi="Calibri"/>
+          <w:b/>
+          <w:color w:val="111111"/>
+          <w:sz w:val="22"/>
+        </w:rPr>
+        <w:t>Route each feature to a preferred credential</w:t>
+      </w:r>
+      <w:r>
+        <w:rPr>
+          <w:rFonts w:ascii="Calibri" w:hAnsi="Calibri"/>
+          <w:b w:val="0"/>
+          <w:color w:val="111111"/>
+          <w:sz w:val="22"/>
+        </w:rPr>
+        <w:t xml:space="preserve"> (</w:t>
+      </w:r>
+      <w:r>
+        <w:rPr>
+          <w:rFonts w:ascii="Consolas" w:hAnsi="Consolas"/>
+          <w:color w:val="333333"/>
+          <w:sz w:val="20"/>
+        </w:rPr>
+        <w:t>route: "primary" | "secondary"</w:t>
+      </w:r>
+      <w:r>
+        <w:rPr>
+          <w:rFonts w:ascii="Calibri" w:hAnsi="Calibri"/>
+          <w:b w:val="0"/>
+          <w:color w:val="111111"/>
+          <w:sz w:val="22"/>
+        </w:rPr>
+        <w:t xml:space="preserve">). Ask AI owns slot 1 so the most latency-sensitive, user-facing path is never starved by bulk generation; the diagnostic (including its speculative prefetch), adaptation, evaluation, Dojo critique, Autopilot and Freelance paths spend slot 2. Routing partitions the free-tier budget </w:t>
+      </w:r>
+      <w:r>
+        <w:rPr>
+          <w:rFonts w:ascii="Calibri" w:hAnsi="Calibri"/>
+          <w:i/>
+          <w:color w:val="111111"/>
+          <w:sz w:val="22"/>
+        </w:rPr>
+        <w:t>without</w:t>
+      </w:r>
+      <w:r>
+        <w:rPr>
+          <w:rFonts w:ascii="Calibri" w:hAnsi="Calibri"/>
+          <w:b w:val="0"/>
+          <w:color w:val="111111"/>
+          <w:sz w:val="22"/>
+        </w:rPr>
+        <w:t xml:space="preserve"> giving up resilience — a route always tries the other configured key before the deterministic provider, and with only one key configured every route simply uses it.</w:t>
       </w:r>
     </w:p>
     <w:p>
@@ -1389,7 +1447,41 @@
           <w:color w:val="111111"/>
           <w:sz w:val="22"/>
         </w:rPr>
-        <w:t>Log token usage and latency for admin analytics.</w:t>
+        <w:t>Log the serving credential and latency (</w:t>
+      </w:r>
+      <w:r>
+        <w:rPr>
+          <w:rFonts w:ascii="Consolas" w:hAnsi="Consolas"/>
+          <w:color w:val="333333"/>
+          <w:sz w:val="20"/>
+        </w:rPr>
+        <w:t>[ai] gemini structured response ok via key 2 (1527ms)</w:t>
+      </w:r>
+      <w:r>
+        <w:rPr>
+          <w:rFonts w:ascii="Calibri" w:hAnsi="Calibri"/>
+          <w:b w:val="0"/>
+          <w:color w:val="111111"/>
+          <w:sz w:val="22"/>
+        </w:rPr>
+        <w:t xml:space="preserve">, </w:t>
+      </w:r>
+      <w:r>
+        <w:rPr>
+          <w:rFonts w:ascii="Consolas" w:hAnsi="Consolas"/>
+          <w:color w:val="333333"/>
+          <w:sz w:val="20"/>
+        </w:rPr>
+        <w:t>[chat] gemini reply ok via key 1 (2301ms)</w:t>
+      </w:r>
+      <w:r>
+        <w:rPr>
+          <w:rFonts w:ascii="Calibri" w:hAnsi="Calibri"/>
+          <w:b w:val="0"/>
+          <w:color w:val="111111"/>
+          <w:sz w:val="22"/>
+        </w:rPr>
+        <w:t>) so quota spend is attributable per feature.</w:t>
       </w:r>
     </w:p>
     <w:p>
@@ -1513,6 +1605,100 @@
           <w:sz w:val="22"/>
         </w:rPr>
         <w:t>: per-domain strength scores 0–1 with confidence values.</w:t>
+      </w:r>
+    </w:p>
+    <w:p>
+      <w:pPr>
+        <w:pStyle w:val="ListBullet"/>
+      </w:pPr>
+      <w:r>
+        <w:rPr>
+          <w:rFonts w:ascii="Calibri" w:hAnsi="Calibri"/>
+          <w:b/>
+          <w:color w:val="111111"/>
+          <w:sz w:val="22"/>
+        </w:rPr>
+        <w:t>Speculative prefetch (latency hiding):</w:t>
+      </w:r>
+      <w:r>
+        <w:rPr>
+          <w:rFonts w:ascii="Calibri" w:hAnsi="Calibri"/>
+          <w:b w:val="0"/>
+          <w:color w:val="111111"/>
+          <w:sz w:val="22"/>
+        </w:rPr>
+        <w:t xml:space="preserve"> while the learner reads/thinks, the service pre-generates </w:t>
+      </w:r>
+      <w:r>
+        <w:rPr>
+          <w:rFonts w:ascii="Calibri" w:hAnsi="Calibri"/>
+          <w:i/>
+          <w:color w:val="111111"/>
+          <w:sz w:val="22"/>
+        </w:rPr>
+        <w:t>both</w:t>
+      </w:r>
+      <w:r>
+        <w:rPr>
+          <w:rFonts w:ascii="Calibri" w:hAnsi="Calibri"/>
+          <w:b w:val="0"/>
+          <w:color w:val="111111"/>
+          <w:sz w:val="22"/>
+        </w:rPr>
+        <w:t xml:space="preserve"> outcome branches (correct → next difficulty up, incorrect → next difficulty down) for the predicted next domain and stores them on the matrix. Answering then serves a ready item in ~10 ms instead of waiting on a live Gemini call. Branches are generated </w:t>
+      </w:r>
+      <w:r>
+        <w:rPr>
+          <w:rFonts w:ascii="Calibri" w:hAnsi="Calibri"/>
+          <w:b/>
+          <w:color w:val="111111"/>
+          <w:sz w:val="22"/>
+        </w:rPr>
+        <w:t>sequentially</w:t>
+      </w:r>
+      <w:r>
+        <w:rPr>
+          <w:rFonts w:ascii="Calibri" w:hAnsi="Calibri"/>
+          <w:b w:val="0"/>
+          <w:color w:val="111111"/>
+          <w:sz w:val="22"/>
+        </w:rPr>
+        <w:t xml:space="preserve"> (never in parallel) and, if the learner answers before the prefetch lands, the answer </w:t>
+      </w:r>
+      <w:r>
+        <w:rPr>
+          <w:rFonts w:ascii="Calibri" w:hAnsi="Calibri"/>
+          <w:b/>
+          <w:color w:val="111111"/>
+          <w:sz w:val="22"/>
+        </w:rPr>
+        <w:t>awaits the same in-flight call</w:t>
+      </w:r>
+      <w:r>
+        <w:rPr>
+          <w:rFonts w:ascii="Calibri" w:hAnsi="Calibri"/>
+          <w:b w:val="0"/>
+          <w:color w:val="111111"/>
+          <w:sz w:val="22"/>
+        </w:rPr>
+        <w:t xml:space="preserve"> rather than firing a duplicate — this keeps concurrency at one request so the free-tier per-key/per-model rate limit is never saturated (parallel prefetch was observed to cascade into 12–45 s timeouts). Persisted prefetches are guarded by </w:t>
+      </w:r>
+      <w:r>
+        <w:rPr>
+          <w:rFonts w:ascii="Consolas" w:hAnsi="Consolas"/>
+          <w:color w:val="333333"/>
+          <w:sz w:val="20"/>
+        </w:rPr>
+        <w:t>history</w:t>
+      </w:r>
+      <w:r>
+        <w:rPr>
+          <w:rFonts w:ascii="Calibri" w:hAnsi="Calibri"/>
+          <w:b w:val="0"/>
+          <w:color w:val="111111"/>
+          <w:sz w:val="22"/>
+        </w:rPr>
+        <w:t xml:space="preserve"> length so a stale branch is discarded, never served. On any prefetch failure the path degrades to normal live generation, then to the deterministic mock.</w:t>
       </w:r>
     </w:p>
     <w:p>
@@ -10180,7 +10366,25 @@
                 <w:color w:val="111111"/>
                 <w:sz w:val="20"/>
               </w:rPr>
-              <w:t>&lt; 2000 ms</w:t>
+              <w:t xml:space="preserve">&lt; 2000 ms live; </w:t>
+            </w:r>
+            <w:r>
+              <w:rPr>
+                <w:rFonts w:ascii="Calibri" w:hAnsi="Calibri"/>
+                <w:b/>
+                <w:color w:val="111111"/>
+                <w:sz w:val="20"/>
+              </w:rPr>
+              <w:t>~10 ms when served from speculative prefetch</w:t>
+            </w:r>
+            <w:r>
+              <w:rPr>
+                <w:rFonts w:ascii="Calibri" w:hAnsi="Calibri"/>
+                <w:b w:val="0"/>
+                <w:color w:val="111111"/>
+                <w:sz w:val="20"/>
+              </w:rPr>
+              <w:t xml:space="preserve"> (the common case — see §4.2)</w:t>
             </w:r>
           </w:p>
         </w:tc>

</xml_diff>